<commit_message>
Move labs to CCNA_Lab_Companion.docx; remove claims I could not confirm; update change log
Co-Authored-By: Claude Sonnet 5.5 <noreply@anthropic.com>
Claude-Session: https://claude.ai/code/session_01FAGx9qgJn3u4VmZ6fESEv2
</commit_message>
<xml_diff>
--- a/study-notes/Basic_Configuration_Commands.docx
+++ b/study-notes/Basic_Configuration_Commands.docx
@@ -4115,7 +4115,7 @@
                 <w:b w:val="0"/>
                 <w:i w:val="0"/>
               </w:rPr>
-              <w:t xml:space="preserve">Lists only the IP access control lists on the device (show access-lists lists all ACL types).</w:t>
+              <w:t xml:space="preserve">Lists the IP access control lists configured on the device.</w:t>
             </w:r>
           </w:p>
         </w:tc>
@@ -5896,7 +5896,7 @@
                 <w:b w:val="0"/>
                 <w:i w:val="0"/>
               </w:rPr>
-              <w:t xml:space="preserve">Global mode. Cisco switches default to PVST+; this switches to Rapid PVST+ (802.1w per VLAN).</w:t>
+              <w:t xml:space="preserve">Global mode. Enables Rapid PVST+ (802.1w per VLAN). Classic Catalyst switches default to PVST+.</w:t>
             </w:r>
           </w:p>
         </w:tc>

</xml_diff>